<commit_message>
docs: add lab 1 report in docx and pdf formats
</commit_message>
<xml_diff>
--- a/Отчет_ЛР1_СУС.docx
+++ b/Отчет_ЛР1_СУС.docx
@@ -2386,7 +2386,21 @@
         <w:rPr>
           <w:sz w:val="22"/>
         </w:rPr>
-        <w:t xml:space="preserve"> (настройка OpenAPI 3 Swagger и Jackson ObjectMapper с модулем JavaTimeModule для корректной сериализации дат);</w:t>
+        <w:t xml:space="preserve"> (настройка </w:t>
+      </w:r>
+      <w:proofErr w:type="spellStart"/>
+      <w:r>
+        <w:rPr>
+          <w:sz w:val="22"/>
+        </w:rPr>
+        <w:t>OpenAPI</w:t>
+      </w:r>
+      <w:proofErr w:type="spellEnd"/>
+      <w:r>
+        <w:rPr>
+          <w:sz w:val="22"/>
+        </w:rPr>
+        <w:t xml:space="preserve"> 3 Swagger и Jackson ObjectMapper с модулем JavaTimeModule для корректной сериализации дат);</w:t>
       </w:r>
     </w:p>
     <w:p>
@@ -5344,7 +5358,21 @@
         <w:rPr>
           <w:sz w:val="22"/>
         </w:rPr>
-        <w:t>В эндпоинте GET /api/attendance реализована бесконечная прокрутка на основе org.springframework.data.domain.Slice. Вместо выполнения дорогостоящего подзапроса SELECT count(*), база запрашивает N+1 записей, определяя наличие следующей страницы (hasNext). Результат оборачивается в компактный DTO SliceResponse;</w:t>
+        <w:t xml:space="preserve">В </w:t>
+      </w:r>
+      <w:proofErr w:type="spellStart"/>
+      <w:r>
+        <w:rPr>
+          <w:sz w:val="22"/>
+        </w:rPr>
+        <w:t>эндпоинте</w:t>
+      </w:r>
+      <w:proofErr w:type="spellEnd"/>
+      <w:r>
+        <w:rPr>
+          <w:sz w:val="22"/>
+        </w:rPr>
+        <w:t xml:space="preserve"> GET /api/attendance реализована бесконечная прокрутка на основе org.springframework.data.domain.Slice. Вместо выполнения дорогостоящего подзапроса SELECT count(*), база запрашивает N+1 записей, определяя наличие следующей страницы (hasNext). Результат оборачивается в компактный DTO SliceResponse;</w:t>
       </w:r>
     </w:p>
     <w:p>
@@ -7645,7 +7673,21 @@
         <w:rPr>
           <w:sz w:val="22"/>
         </w:rPr>
-        <w:t xml:space="preserve"> JPQL-запрос findOverlappingShiftsForEmployee выявляет смены, на которые сотрудник уже назначен в тот же день и интервалы времени которых накладываются друг на друга;</w:t>
+        <w:t xml:space="preserve"> JPQL-запрос </w:t>
+      </w:r>
+      <w:proofErr w:type="spellStart"/>
+      <w:r>
+        <w:rPr>
+          <w:sz w:val="22"/>
+        </w:rPr>
+        <w:t>findOverlappingShiftsForEmployee</w:t>
+      </w:r>
+      <w:proofErr w:type="spellEnd"/>
+      <w:r>
+        <w:rPr>
+          <w:sz w:val="22"/>
+        </w:rPr>
+        <w:t xml:space="preserve"> выявляет смены, на которые сотрудник уже назначен в тот же день и интервалы времени которых накладываются друг на друга;</w:t>
       </w:r>
     </w:p>
     <w:p>
@@ -8263,13 +8305,7 @@
         <w:rPr>
           <w:sz w:val="22"/>
         </w:rPr>
-        <w:t xml:space="preserve"> первом этапе проект компилируется и собирается в JAR-архив</w:t>
-      </w:r>
-      <w:r>
-        <w:rPr>
-          <w:sz w:val="22"/>
-        </w:rPr>
-        <w:t>.</w:t>
+        <w:t xml:space="preserve"> первом этапе проект компилируется и собирается в JAR-архив.</w:t>
       </w:r>
       <w:r>
         <w:rPr>
@@ -8686,13 +8722,7 @@
         <w:rPr>
           <w:sz w:val="22"/>
         </w:rPr>
-        <w:t xml:space="preserve">. </w:t>
-      </w:r>
-      <w:r>
-        <w:rPr>
-          <w:sz w:val="22"/>
-        </w:rPr>
-        <w:t xml:space="preserve">Это позволяет тестировать различные сценарии работы сервисов без необходимости запускать </w:t>
+        <w:t xml:space="preserve">. Это позволяет тестировать различные сценарии работы сервисов без необходимости запускать </w:t>
       </w:r>
       <w:proofErr w:type="spellStart"/>
       <w:r>
@@ -8852,16 +8882,67 @@
     </w:p>
     <w:p>
       <w:pPr>
-        <w:spacing w:after="80" w:line="276" w:lineRule="auto"/>
-        <w:jc w:val="both"/>
         <w:rPr>
           <w:szCs w:val="28"/>
         </w:rPr>
       </w:pPr>
       <w:r>
+        <w:drawing>
+          <wp:inline distT="0" distB="0" distL="0" distR="0" wp14:anchorId="6FDB03F9" wp14:editId="40344FAF">
+            <wp:extent cx="5893473" cy="2477729"/>
+            <wp:effectExtent l="0" t="0" r="0" b="0"/>
+            <wp:docPr id="1859383149" name="Рисунок 1"/>
+            <wp:cNvGraphicFramePr>
+              <a:graphicFrameLocks xmlns:a="http://schemas.openxmlformats.org/drawingml/2006/main" noChangeAspect="1"/>
+            </wp:cNvGraphicFramePr>
+            <a:graphic xmlns:a="http://schemas.openxmlformats.org/drawingml/2006/main">
+              <a:graphicData uri="http://schemas.openxmlformats.org/drawingml/2006/picture">
+                <pic:pic xmlns:pic="http://schemas.openxmlformats.org/drawingml/2006/picture">
+                  <pic:nvPicPr>
+                    <pic:cNvPr id="1859383149" name=""/>
+                    <pic:cNvPicPr/>
+                  </pic:nvPicPr>
+                  <pic:blipFill>
+                    <a:blip r:embed="rId14"/>
+                    <a:stretch>
+                      <a:fillRect/>
+                    </a:stretch>
+                  </pic:blipFill>
+                  <pic:spPr>
+                    <a:xfrm>
+                      <a:off x="0" y="0"/>
+                      <a:ext cx="5968711" cy="2509361"/>
+                    </a:xfrm>
+                    <a:prstGeom prst="rect">
+                      <a:avLst/>
+                    </a:prstGeom>
+                  </pic:spPr>
+                </pic:pic>
+              </a:graphicData>
+            </a:graphic>
+          </wp:inline>
+        </w:drawing>
+      </w:r>
+    </w:p>
+    <w:p>
+      <w:pPr>
+        <w:pStyle w:val="af2"/>
+      </w:pPr>
+      <w:r>
+        <w:t>Рисунок 2. Тестовое покрытие</w:t>
+      </w:r>
+    </w:p>
+    <w:p>
+      <w:pPr>
+        <w:rPr>
+          <w:szCs w:val="28"/>
+        </w:rPr>
+      </w:pPr>
+      <w:r>
         <w:rPr>
           <w:noProof/>
         </w:rPr>
+        <w:lastRenderedPageBreak/>
         <w:drawing>
           <wp:inline distT="0" distB="0" distL="0" distR="0" wp14:anchorId="716D0A07" wp14:editId="7F269989">
             <wp:extent cx="6120130" cy="1402715"/>
@@ -8878,7 +8959,7 @@
                     <pic:cNvPicPr/>
                   </pic:nvPicPr>
                   <pic:blipFill>
-                    <a:blip r:embed="rId14"/>
+                    <a:blip r:embed="rId15"/>
                     <a:stretch>
                       <a:fillRect/>
                     </a:stretch>
@@ -8901,37 +8982,16 @@
     </w:p>
     <w:p>
       <w:pPr>
-        <w:keepNext/>
-        <w:spacing w:before="80" w:after="200"/>
-        <w:jc w:val="center"/>
-      </w:pPr>
-      <w:r>
-        <w:rPr>
-          <w:i/>
-          <w:sz w:val="20"/>
-        </w:rPr>
+        <w:pStyle w:val="af2"/>
+      </w:pPr>
+      <w:r>
         <w:t xml:space="preserve">Рисунок </w:t>
       </w:r>
       <w:r>
-        <w:rPr>
-          <w:i/>
-          <w:sz w:val="20"/>
-        </w:rPr>
-        <w:t>2</w:t>
-      </w:r>
-      <w:r>
-        <w:rPr>
-          <w:i/>
-          <w:sz w:val="20"/>
-        </w:rPr>
-        <w:t xml:space="preserve">. </w:t>
-      </w:r>
-      <w:r>
-        <w:rPr>
-          <w:i/>
-          <w:sz w:val="20"/>
-        </w:rPr>
-        <w:t>Результат прохождения тестов</w:t>
+        <w:t>3</w:t>
+      </w:r>
+      <w:r>
+        <w:t>. Результат прохождения тестов</w:t>
       </w:r>
     </w:p>
     <w:p>
@@ -8939,7 +8999,6 @@
         <w:t>Все разработанные модульные и интеграционные тесты успешно проходят без ошибок, что подтверждает корректность реализованной функциональности и стабильность приложения</w:t>
       </w:r>
     </w:p>
-    <w:p/>
     <w:p>
       <w:pPr>
         <w:rPr>
@@ -8949,9 +9008,6 @@
           <w:szCs w:val="36"/>
         </w:rPr>
       </w:pPr>
-      <w:r>
-        <w:br w:type="page"/>
-      </w:r>
     </w:p>
     <w:p>
       <w:pPr>
@@ -8959,7 +9015,6 @@
       </w:pPr>
       <w:bookmarkStart w:id="10" w:name="_Toc241201290"/>
       <w:r>
-        <w:lastRenderedPageBreak/>
         <w:t>8. Выводы</w:t>
       </w:r>
       <w:bookmarkEnd w:id="10"/>
@@ -9105,7 +9160,7 @@
       </w:r>
     </w:p>
     <w:sectPr>
-      <w:footerReference w:type="first" r:id="rId15"/>
+      <w:footerReference w:type="first" r:id="rId16"/>
       <w:pgSz w:w="11906" w:h="16838"/>
       <w:pgMar w:top="1134" w:right="1134" w:bottom="998" w:left="1134" w:header="708" w:footer="708" w:gutter="0"/>
       <w:cols w:space="708"/>
@@ -14644,6 +14699,7 @@
   <w:style w:type="character" w:default="1" w:styleId="a1">
     <w:name w:val="Default Paragraph Font"/>
     <w:uiPriority w:val="1"/>
+    <w:semiHidden/>
     <w:unhideWhenUsed/>
   </w:style>
   <w:style w:type="table" w:default="1" w:styleId="a2">
@@ -16055,6 +16111,16 @@
 </file>
 
 <file path=customXml/item2.xml><?xml version="1.0" encoding="utf-8"?>
+<p:properties xmlns:p="http://schemas.microsoft.com/office/2006/metadata/properties" xmlns:xsi="http://www.w3.org/2001/XMLSchema-instance" xmlns:pc="http://schemas.microsoft.com/office/infopath/2007/PartnerControls">
+  <documentManagement/>
+</p:properties>
+</file>
+
+<file path=customXml/item3.xml><?xml version="1.0" encoding="utf-8"?>
+<b:Sources xmlns:b="http://schemas.openxmlformats.org/officeDocument/2006/bibliography" xmlns="http://schemas.openxmlformats.org/officeDocument/2006/bibliography" SelectedStyle="\APASixthEditionOfficeOnline.xsl" StyleName="APA" Version="6"/>
+</file>
+
+<file path=customXml/item4.xml><?xml version="1.0" encoding="utf-8"?>
 <ct:contentTypeSchema xmlns:ct="http://schemas.microsoft.com/office/2006/metadata/contentType" xmlns:ma="http://schemas.microsoft.com/office/2006/metadata/properties/metaAttributes" ct:_="" ma:_="" ma:contentTypeName="Документ" ma:contentTypeID="0x010100052CD5DA0C97454790DC060511AED1FE" ma:contentTypeVersion="9" ma:contentTypeDescription="Создание документа." ma:contentTypeScope="" ma:versionID="9fa5e41e5fb4c1dcc24994b92e10ffd4">
   <xsd:schema xmlns:xsd="http://www.w3.org/2001/XMLSchema" xmlns:xs="http://www.w3.org/2001/XMLSchema" xmlns:p="http://schemas.microsoft.com/office/2006/metadata/properties" xmlns:ns3="b5bd2afb-8df3-4b82-a114-8e1b04f3bac8" targetNamespace="http://schemas.microsoft.com/office/2006/metadata/properties" ma:root="true" ma:fieldsID="0dd316b6ddef4bde2718acd09ef20040" ns3:_="">
     <xsd:import namespace="b5bd2afb-8df3-4b82-a114-8e1b04f3bac8"/>
@@ -16230,16 +16296,6 @@
 </ct:contentTypeSchema>
 </file>
 
-<file path=customXml/item3.xml><?xml version="1.0" encoding="utf-8"?>
-<b:Sources xmlns:b="http://schemas.openxmlformats.org/officeDocument/2006/bibliography" xmlns="http://schemas.openxmlformats.org/officeDocument/2006/bibliography" SelectedStyle="\APASixthEditionOfficeOnline.xsl" StyleName="APA" Version="6"/>
-</file>
-
-<file path=customXml/item4.xml><?xml version="1.0" encoding="utf-8"?>
-<p:properties xmlns:p="http://schemas.microsoft.com/office/2006/metadata/properties" xmlns:xsi="http://www.w3.org/2001/XMLSchema-instance" xmlns:pc="http://schemas.microsoft.com/office/infopath/2007/PartnerControls">
-  <documentManagement/>
-</p:properties>
-</file>
-
 <file path=customXml/itemProps1.xml><?xml version="1.0" encoding="utf-8"?>
 <ds:datastoreItem xmlns:ds="http://schemas.openxmlformats.org/officeDocument/2006/customXml" ds:itemID="{27A224E5-3AE3-4E19-AA3D-95E882C893FB}">
   <ds:schemaRefs>
@@ -16249,6 +16305,23 @@
 </file>
 
 <file path=customXml/itemProps2.xml><?xml version="1.0" encoding="utf-8"?>
+<ds:datastoreItem xmlns:ds="http://schemas.openxmlformats.org/officeDocument/2006/customXml" ds:itemID="{2545F66C-9ACF-4CFE-A8D6-A0E001333455}">
+  <ds:schemaRefs>
+    <ds:schemaRef ds:uri="http://schemas.microsoft.com/office/2006/metadata/properties"/>
+    <ds:schemaRef ds:uri="http://schemas.microsoft.com/office/infopath/2007/PartnerControls"/>
+  </ds:schemaRefs>
+</ds:datastoreItem>
+</file>
+
+<file path=customXml/itemProps3.xml><?xml version="1.0" encoding="utf-8"?>
+<ds:datastoreItem xmlns:ds="http://schemas.openxmlformats.org/officeDocument/2006/customXml" ds:itemID="{9484D5D0-7CBA-47F2-873C-09EB0C2B51E2}">
+  <ds:schemaRefs>
+    <ds:schemaRef ds:uri="http://schemas.openxmlformats.org/officeDocument/2006/bibliography"/>
+  </ds:schemaRefs>
+</ds:datastoreItem>
+</file>
+
+<file path=customXml/itemProps4.xml><?xml version="1.0" encoding="utf-8"?>
 <ds:datastoreItem xmlns:ds="http://schemas.openxmlformats.org/officeDocument/2006/customXml" ds:itemID="{BCC46212-76D3-44FE-87D4-8F1562A52A29}">
   <ds:schemaRefs>
     <ds:schemaRef ds:uri="http://schemas.microsoft.com/office/2006/metadata/contentType"/>
@@ -16264,21 +16337,4 @@
     <ds:schemaRef ds:uri="http://schemas.microsoft.com/internal/obd"/>
   </ds:schemaRefs>
 </ds:datastoreItem>
-</file>
-
-<file path=customXml/itemProps3.xml><?xml version="1.0" encoding="utf-8"?>
-<ds:datastoreItem xmlns:ds="http://schemas.openxmlformats.org/officeDocument/2006/customXml" ds:itemID="{9484D5D0-7CBA-47F2-873C-09EB0C2B51E2}">
-  <ds:schemaRefs>
-    <ds:schemaRef ds:uri="http://schemas.openxmlformats.org/officeDocument/2006/bibliography"/>
-  </ds:schemaRefs>
-</ds:datastoreItem>
-</file>
-
-<file path=customXml/itemProps4.xml><?xml version="1.0" encoding="utf-8"?>
-<ds:datastoreItem xmlns:ds="http://schemas.openxmlformats.org/officeDocument/2006/customXml" ds:itemID="{2545F66C-9ACF-4CFE-A8D6-A0E001333455}">
-  <ds:schemaRefs>
-    <ds:schemaRef ds:uri="http://schemas.microsoft.com/office/2006/metadata/properties"/>
-    <ds:schemaRef ds:uri="http://schemas.microsoft.com/office/infopath/2007/PartnerControls"/>
-  </ds:schemaRefs>
-</ds:datastoreItem>
 </file>
</xml_diff>